<commit_message>
Update 5A/5E from the readings; match map and binsreg code to course guide
Co-Authored-By: Claude Opus 5.5 <noreply@anthropic.com>
Claude-Session: https://claude.ai/code/session_01KAw4W3VS31wfj9ZhywYngh
</commit_message>
<xml_diff>
--- a/climate_mortality_pset/Climate_mortality_answers.docx
+++ b/climate_mortality_pset/Climate_mortality_answers.docx
@@ -3909,7 +3909,7 @@
               <w:spacing w:after="120"/>
             </w:pPr>
             <w:r>
-              <w:t xml:space="preserve">1. Firm location choices: polluting firms locate where land and labor are cheap, which tends to be in lower-income neighborhoods.</w:t>
+              <w:t xml:space="preserve">Banzhaf, Ma, and Timmins group the possible mechanisms into four categories:</w:t>
             </w:r>
           </w:p>
           <w:p>
@@ -3917,7 +3917,7 @@
               <w:spacing w:after="120"/>
             </w:pPr>
             <w:r>
-              <w:t xml:space="preserve">2. Residential sorting ("coming to the nuisance"): after a polluting site is built, nearby house prices fall, and lower-income households move in because housing is cheaper, while richer households who care more about clean air move out.</w:t>
+              <w:t xml:space="preserve">1. Disproportionate siting: firms put polluting facilities in poor or minority neighborhoods, either because of discrimination or, more often, because those areas have cheap land, low-wage labor, and access to highways and railroads (which themselves may have been placed there because of past discrimination).</w:t>
             </w:r>
           </w:p>
           <w:p>
@@ -3925,7 +3925,7 @@
               <w:spacing w:after="120"/>
             </w:pPr>
             <w:r>
-              <w:t xml:space="preserve">3. Discrimination: in housing markets (redlining, steering minority households toward certain neighborhoods) or in siting decisions themselves.</w:t>
+              <w:t xml:space="preserve">2. Coming to the nuisance: the pollution is already there, and households sort around it. Pollution lowers nearby house prices, so lower-income households, who can't afford to outbid richer households for cleaner neighborhoods, end up living near it (Tiebout sorting).</w:t>
             </w:r>
           </w:p>
           <w:p>
@@ -3933,7 +3933,15 @@
               <w:spacing w:after="120"/>
             </w:pPr>
             <w:r>
-              <w:t xml:space="preserve">4. Political economy: communities with less political power, money, or organization are less able to block a polluting facility (or accept smaller compensation), so firms and governments face less resistance putting sites there.</w:t>
+              <w:t xml:space="preserve">3. Coasean bargaining: firms and communities effectively negotiate over where pollution goes. Communities that would accept less compensation, or that have less ability to organize and bargain, end up with more polluting facilities.</w:t>
+            </w:r>
+          </w:p>
+          <w:p>
+            <w:pPr>
+              <w:spacing w:after="120"/>
+            </w:pPr>
+            <w:r>
+              <w:t xml:space="preserve">4. Political economy and government: regulators decide where to permit, inspect, enforce, and clean up. Communities with more political power and ability to take collective action can push for stricter enforcement, so pollution ends up in places with less political voice.</w:t>
             </w:r>
           </w:p>
         </w:tc>
@@ -4189,7 +4197,7 @@
               <w:spacing w:after="120"/>
             </w:pPr>
             <w:r>
-              <w:t xml:space="preserve">Not necessarily. Some reasons why the money might not be wasted:</w:t>
+              <w:t xml:space="preserve">Not necessarily, but the paper suggests the money could probably be spent better. Greenstone and Gallagher give three possible explanations for the zero effect in Section VII:</w:t>
             </w:r>
           </w:p>
           <w:p>
@@ -4197,7 +4205,7 @@
               <w:spacing w:after="120"/>
             </w:pPr>
             <w:r>
-              <w:t xml:space="preserve">• Being placed on the NPL isn't the same as being cleaned up. Many cleanups take years or decades, so by 2000 lots of sites were still in progress, and the full benefits might not show up yet.</w:t>
+              <w:t xml:space="preserve">1. The people who live near these sites may just not value the cleanups very much. People who care a lot about avoiding toxic waste don't live there in the first place, so the cleanup gives local residents something they don't value highly (even if the average American would value it more).</w:t>
             </w:r>
           </w:p>
           <w:p>
@@ -4205,7 +4213,7 @@
               <w:spacing w:after="120"/>
             </w:pPr>
             <w:r>
-              <w:t xml:space="preserve">• House prices only capture benefits that homebuyers know about and care about. If people don't know about the health risks, or if the benefits go to people who don't own nearby homes (like groundwater users, workers, or future generations), they won't show up in prices.</w:t>
+              <w:t xml:space="preserve">2. People may believe the cleanups don't really reduce health risks. The epidemiological evidence on health benefits from cleanups isn't strong, so it could be rational to place a low value on them. If future research found big health benefits, valuations could go up.</w:t>
             </w:r>
           </w:p>
           <w:p>
@@ -4213,7 +4221,7 @@
               <w:spacing w:after="120"/>
             </w:pPr>
             <w:r>
-              <w:t xml:space="preserve">• Listing a site can also make people more aware of the contamination, which could push prices down and cancel out the effect of cleanup.</w:t>
+              <w:t xml:space="preserve">3. The control sites may have been partly cleaned up too, by state or local programs. The authors checked and found that most non-NPL sites got little or no cleanup (about $3 million on average where there was any), so the result really reflects the extra ~$40 million Superfund spends.</w:t>
             </w:r>
           </w:p>
           <w:p>
@@ -4221,7 +4229,7 @@
               <w:spacing w:after="120"/>
             </w:pPr>
             <w:r>
-              <w:t xml:space="preserve">• The estimates are imprecise, so we can't rule out moderate positive effects.</w:t>
+              <w:t xml:space="preserve">They think the first two are the most likely, which means local residents' benefits fall well short of the costs. But that doesn't automatically mean the money is wasted, because house prices don't capture every benefit. There could be benefits to people who don't live near the site, to ecosystems, and from protecting groundwater. Also, many sites weren't fully cleaned up even by 2000, and the estimates can't rule out modest positive effects.</w:t>
             </w:r>
           </w:p>
           <w:p>
@@ -4229,7 +4237,7 @@
               <w:spacing w:after="120"/>
             </w:pPr>
             <w:r>
-              <w:t xml:space="preserve">On the other hand, Greenstone and Gallagher's results do suggest that the local housing benefits are small compared to the $40 million average cost, so it's fair to ask whether the same money could do more good somewhere else, for example by focusing on the sites with the biggest health risks.</w:t>
+              <w:t xml:space="preserve">Their conclusion is that unless those other benefits are large, cheaper approaches like fences, warning signs, and simply containing the toxic waste might be a more efficient use of the money.</w:t>
             </w:r>
           </w:p>
         </w:tc>

</xml_diff>

<commit_message>
Use user's own R figures for 1A-1C
Co-Authored-By: Claude Opus 5.5 <noreply@anthropic.com>
Claude-Session: https://claude.ai/code/session_01KAw4W3VS31wfj9ZhywYngh
</commit_message>
<xml_diff>
--- a/climate_mortality_pset/Climate_mortality_answers.docx
+++ b/climate_mortality_pset/Climate_mortality_answers.docx
@@ -68,7 +68,7 @@
             <w:r>
               <w:drawing>
                 <wp:inline distT="0" distB="0" distL="0" distR="0">
-                  <wp:extent cx="4343400" cy="2790825"/>
+                  <wp:extent cx="4343400" cy="3152775"/>
                   <wp:effectExtent t="0" r="0" b="0" l="0"/>
                   <wp:docPr id="1" name="" descr="" title=""/>
                   <wp:cNvGraphicFramePr>
@@ -93,7 +93,7 @@
                         <pic:spPr bwMode="auto">
                           <a:xfrm>
                             <a:off x="0" y="0"/>
-                            <a:ext cx="4343400" cy="2790825"/>
+                            <a:ext cx="4343400" cy="3152775"/>
                           </a:xfrm>
                           <a:prstGeom prst="rect">
                             <a:avLst/>
@@ -113,7 +113,7 @@
             <w:r>
               <w:drawing>
                 <wp:inline distT="0" distB="0" distL="0" distR="0">
-                  <wp:extent cx="4343400" cy="2790825"/>
+                  <wp:extent cx="4343400" cy="3152775"/>
                   <wp:effectExtent t="0" r="0" b="0" l="0"/>
                   <wp:docPr id="1" name="" descr="" title=""/>
                   <wp:cNvGraphicFramePr>
@@ -138,7 +138,7 @@
                         <pic:spPr bwMode="auto">
                           <a:xfrm>
                             <a:off x="0" y="0"/>
-                            <a:ext cx="4343400" cy="2790825"/>
+                            <a:ext cx="4343400" cy="3152775"/>
                           </a:xfrm>
                           <a:prstGeom prst="rect">
                             <a:avLst/>
@@ -206,7 +206,7 @@
             <w:r>
               <w:drawing>
                 <wp:inline distT="0" distB="0" distL="0" distR="0">
-                  <wp:extent cx="4343400" cy="2790825"/>
+                  <wp:extent cx="4343400" cy="3152775"/>
                   <wp:effectExtent t="0" r="0" b="0" l="0"/>
                   <wp:docPr id="1" name="" descr="" title=""/>
                   <wp:cNvGraphicFramePr>
@@ -231,7 +231,7 @@
                         <pic:spPr bwMode="auto">
                           <a:xfrm>
                             <a:off x="0" y="0"/>
-                            <a:ext cx="4343400" cy="2790825"/>
+                            <a:ext cx="4343400" cy="3152775"/>
                           </a:xfrm>
                           <a:prstGeom prst="rect">
                             <a:avLst/>
@@ -251,7 +251,7 @@
             <w:r>
               <w:drawing>
                 <wp:inline distT="0" distB="0" distL="0" distR="0">
-                  <wp:extent cx="4343400" cy="2790825"/>
+                  <wp:extent cx="4343400" cy="3152775"/>
                   <wp:effectExtent t="0" r="0" b="0" l="0"/>
                   <wp:docPr id="1" name="" descr="" title=""/>
                   <wp:cNvGraphicFramePr>
@@ -276,7 +276,7 @@
                         <pic:spPr bwMode="auto">
                           <a:xfrm>
                             <a:off x="0" y="0"/>
-                            <a:ext cx="4343400" cy="2790825"/>
+                            <a:ext cx="4343400" cy="3152775"/>
                           </a:xfrm>
                           <a:prstGeom prst="rect">
                             <a:avLst/>
@@ -344,7 +344,7 @@
             <w:r>
               <w:drawing>
                 <wp:inline distT="0" distB="0" distL="0" distR="0">
-                  <wp:extent cx="4343400" cy="2790825"/>
+                  <wp:extent cx="4343400" cy="3152775"/>
                   <wp:effectExtent t="0" r="0" b="0" l="0"/>
                   <wp:docPr id="1" name="" descr="" title=""/>
                   <wp:cNvGraphicFramePr>
@@ -369,7 +369,7 @@
                         <pic:spPr bwMode="auto">
                           <a:xfrm>
                             <a:off x="0" y="0"/>
-                            <a:ext cx="4343400" cy="2790825"/>
+                            <a:ext cx="4343400" cy="3152775"/>
                           </a:xfrm>
                           <a:prstGeom prst="rect">
                             <a:avLst/>
@@ -389,7 +389,7 @@
             <w:r>
               <w:drawing>
                 <wp:inline distT="0" distB="0" distL="0" distR="0">
-                  <wp:extent cx="4343400" cy="2790825"/>
+                  <wp:extent cx="4343400" cy="3152775"/>
                   <wp:effectExtent t="0" r="0" b="0" l="0"/>
                   <wp:docPr id="1" name="" descr="" title=""/>
                   <wp:cNvGraphicFramePr>
@@ -414,7 +414,7 @@
                         <pic:spPr bwMode="auto">
                           <a:xfrm>
                             <a:off x="0" y="0"/>
-                            <a:ext cx="4343400" cy="2790825"/>
+                            <a:ext cx="4343400" cy="3152775"/>
                           </a:xfrm>
                           <a:prstGeom prst="rect">
                             <a:avLst/>
@@ -425,6 +425,14 @@
                   </a:graphic>
                 </wp:inline>
               </w:drawing>
+            </w:r>
+          </w:p>
+          <w:p>
+            <w:pPr>
+              <w:spacing w:after="120"/>
+            </w:pPr>
+            <w:r>
+              <w:t xml:space="preserve">Alaska and Hawaii are not in the data (shown in grey).</w:t>
             </w:r>
           </w:p>
         </w:tc>

</xml_diff>

<commit_message>
Use user's own binsreg plots for 2A-2B
Co-Authored-By: Claude Opus 5.5 <noreply@anthropic.com>
Claude-Session: https://claude.ai/code/session_01KAw4W3VS31wfj9ZhywYngh
</commit_message>
<xml_diff>
--- a/climate_mortality_pset/Climate_mortality_answers.docx
+++ b/climate_mortality_pset/Climate_mortality_answers.docx
@@ -490,7 +490,7 @@
             <w:r>
               <w:drawing>
                 <wp:inline distT="0" distB="0" distL="0" distR="0">
-                  <wp:extent cx="4343400" cy="2790825"/>
+                  <wp:extent cx="4343400" cy="3152775"/>
                   <wp:effectExtent t="0" r="0" b="0" l="0"/>
                   <wp:docPr id="1" name="" descr="" title=""/>
                   <wp:cNvGraphicFramePr>
@@ -515,7 +515,7 @@
                         <pic:spPr bwMode="auto">
                           <a:xfrm>
                             <a:off x="0" y="0"/>
-                            <a:ext cx="4343400" cy="2790825"/>
+                            <a:ext cx="4343400" cy="3152775"/>
                           </a:xfrm>
                           <a:prstGeom prst="rect">
                             <a:avLst/>
@@ -533,7 +533,7 @@
               <w:spacing w:after="120"/>
             </w:pPr>
             <w:r>
-              <w:t xml:space="preserve">Y = drate_6599 (deaths per 100,000, ages 65+), X = ave_temp (F).</w:t>
+              <w:t xml:space="preserve">drate_6599 is deaths per 100,000 people aged 65+; ave_temp is average monthly temperature (F).</w:t>
             </w:r>
           </w:p>
         </w:tc>
@@ -591,7 +591,7 @@
             <w:r>
               <w:drawing>
                 <wp:inline distT="0" distB="0" distL="0" distR="0">
-                  <wp:extent cx="4343400" cy="2790825"/>
+                  <wp:extent cx="4343400" cy="3152775"/>
                   <wp:effectExtent t="0" r="0" b="0" l="0"/>
                   <wp:docPr id="1" name="" descr="" title=""/>
                   <wp:cNvGraphicFramePr>
@@ -616,7 +616,7 @@
                         <pic:spPr bwMode="auto">
                           <a:xfrm>
                             <a:off x="0" y="0"/>
-                            <a:ext cx="4343400" cy="2790825"/>
+                            <a:ext cx="4343400" cy="3152775"/>
                           </a:xfrm>
                           <a:prstGeom prst="rect">
                             <a:avLst/>

</xml_diff>